<commit_message>
PDF isterleri icin final duzeltmeler ve teslim dosyalari eklendi
</commit_message>
<xml_diff>
--- a/rapor.docx
+++ b/rapor.docx
@@ -300,7 +300,7 @@
                 <w:color w:val="000000"/>
                 <w:sz w:val="20"/>
               </w:rPr>
-              <w:t>0.7975 ± 0.0625</w:t>
+              <w:t>0.8015 ± 0.0588</w:t>
             </w:r>
           </w:p>
         </w:tc>
@@ -320,7 +320,7 @@
                 <w:color w:val="000000"/>
                 <w:sz w:val="20"/>
               </w:rPr>
-              <w:t>0.0021 ± 0.0041</w:t>
+              <w:t>0.0000 ± 0.0000</w:t>
             </w:r>
           </w:p>
         </w:tc>
@@ -362,7 +362,7 @@
                 <w:color w:val="000000"/>
                 <w:sz w:val="20"/>
               </w:rPr>
-              <w:t>0.8006 ± 0.0583</w:t>
+              <w:t>0.8064 ± 0.0622</w:t>
             </w:r>
           </w:p>
         </w:tc>
@@ -382,7 +382,7 @@
                 <w:color w:val="000000"/>
                 <w:sz w:val="20"/>
               </w:rPr>
-              <w:t>0.0000 ± 0.0000</w:t>
+              <w:t>0.0086 ± 0.0173</w:t>
             </w:r>
           </w:p>
         </w:tc>
@@ -506,7 +506,7 @@
                 <w:color w:val="000000"/>
                 <w:sz w:val="20"/>
               </w:rPr>
-              <w:t>0.0680 ± 0.0000</w:t>
+              <w:t>0.0685 ± 0.0000</w:t>
             </w:r>
           </w:p>
         </w:tc>
@@ -561,7 +561,7 @@
           <w:color w:val="000000"/>
           <w:sz w:val="22"/>
         </w:rPr>
-        <w:t>Modellerin veri kalitesindeki düşüşlere ve daha önce karşılaşılmamış örüntülere (unseen patterns) karşı dayanıklılığını ölçmek için Gaussian gürültü eklenmiş veri seti ve görülmemiş veri senaryosu test edilmiştir. Accuracy/Precision/Recall değerleri gürültü deneyine (seed 42) aittir.</w:t>
+        <w:t>Modellerin veri kalitesindeki düşüşlere ve daha önce karşılaşılmamış örüntülere (unseen patterns) karşı dayanıklılığını ölçmek için Gaussian gürültü eklenmiş veri seti ve görülmemiş veri senaryosu test edilmiştir. Gürültü deneyi PDF IX-A uyarınca 5 random seed ile çalıştırılmış olup F1/Accuracy/Precision/Recall değerleri 5 seed ortalamasıdır (mean ± std). Automata model+veri açısından deterministik olduğundan tek kez (gürültü çekimi sabit seed=42) üretilmiştir.</w:t>
       </w:r>
     </w:p>
     <w:p>
@@ -828,7 +828,7 @@
                 <w:color w:val="000000"/>
                 <w:sz w:val="17"/>
               </w:rPr>
-              <w:t>0.0021 ± 0.0041</w:t>
+              <w:t>0.0000 ± 0.0000</w:t>
             </w:r>
           </w:p>
         </w:tc>
@@ -848,7 +848,7 @@
                 <w:color w:val="000000"/>
                 <w:sz w:val="17"/>
               </w:rPr>
-              <w:t>0.0111</w:t>
+              <w:t>0.0142 ± 0.0098</w:t>
             </w:r>
           </w:p>
         </w:tc>
@@ -868,7 +868,7 @@
                 <w:color w:val="000000"/>
                 <w:sz w:val="17"/>
               </w:rPr>
-              <w:t>0.7861</w:t>
+              <w:t>0.7776</w:t>
             </w:r>
           </w:p>
         </w:tc>
@@ -888,7 +888,7 @@
                 <w:color w:val="000000"/>
                 <w:sz w:val="17"/>
               </w:rPr>
-              <w:t>0.0100</w:t>
+              <w:t>0.0124</w:t>
             </w:r>
           </w:p>
         </w:tc>
@@ -908,7 +908,7 @@
                 <w:color w:val="000000"/>
                 <w:sz w:val="17"/>
               </w:rPr>
-              <w:t>0.0125</w:t>
+              <w:t>0.0175</w:t>
             </w:r>
           </w:p>
         </w:tc>
@@ -948,7 +948,7 @@
                 <w:color w:val="000000"/>
                 <w:sz w:val="17"/>
               </w:rPr>
-              <w:t>Gaussian noise</w:t>
+              <w:t>Gaussian noise (5 seed)</w:t>
             </w:r>
           </w:p>
         </w:tc>
@@ -990,7 +990,7 @@
                 <w:color w:val="000000"/>
                 <w:sz w:val="17"/>
               </w:rPr>
-              <w:t>0.0000 ± 0.0000</w:t>
+              <w:t>0.0086 ± 0.0173</w:t>
             </w:r>
           </w:p>
         </w:tc>
@@ -1010,7 +1010,7 @@
                 <w:color w:val="000000"/>
                 <w:sz w:val="17"/>
               </w:rPr>
-              <w:t>0.0118</w:t>
+              <w:t>0.0133 ± 0.0100</w:t>
             </w:r>
           </w:p>
         </w:tc>
@@ -1030,7 +1030,7 @@
                 <w:color w:val="000000"/>
                 <w:sz w:val="17"/>
               </w:rPr>
-              <w:t>0.7981</w:t>
+              <w:t>0.7875</w:t>
             </w:r>
           </w:p>
         </w:tc>
@@ -1050,7 +1050,7 @@
                 <w:color w:val="000000"/>
                 <w:sz w:val="17"/>
               </w:rPr>
-              <w:t>0.0111</w:t>
+              <w:t>0.0124</w:t>
             </w:r>
           </w:p>
         </w:tc>
@@ -1070,7 +1070,7 @@
                 <w:color w:val="000000"/>
                 <w:sz w:val="17"/>
               </w:rPr>
-              <w:t>0.0125</w:t>
+              <w:t>0.0150</w:t>
             </w:r>
           </w:p>
         </w:tc>
@@ -1110,7 +1110,7 @@
                 <w:color w:val="000000"/>
                 <w:sz w:val="17"/>
               </w:rPr>
-              <w:t>Gaussian noise</w:t>
+              <w:t>Gaussian noise (5 seed)</w:t>
             </w:r>
           </w:p>
         </w:tc>
@@ -1314,7 +1314,7 @@
                 <w:color w:val="000000"/>
                 <w:sz w:val="17"/>
               </w:rPr>
-              <w:t>0.0680 ± 0.0000</w:t>
+              <w:t>0.0685 ± 0.0000</w:t>
             </w:r>
           </w:p>
         </w:tc>
@@ -1334,7 +1334,7 @@
                 <w:color w:val="000000"/>
                 <w:sz w:val="17"/>
               </w:rPr>
-              <w:t>0.0420</w:t>
+              <w:t>0.1103</w:t>
             </w:r>
           </w:p>
         </w:tc>
@@ -1354,7 +1354,7 @@
                 <w:color w:val="000000"/>
                 <w:sz w:val="17"/>
               </w:rPr>
-              <w:t>0.8347</w:t>
+              <w:t>0.8444</w:t>
             </w:r>
           </w:p>
         </w:tc>
@@ -1374,7 +1374,7 @@
                 <w:color w:val="000000"/>
                 <w:sz w:val="17"/>
               </w:rPr>
-              <w:t>0.0476</w:t>
+              <w:t>0.1231</w:t>
             </w:r>
           </w:p>
         </w:tc>
@@ -1394,7 +1394,7 @@
                 <w:color w:val="000000"/>
                 <w:sz w:val="17"/>
               </w:rPr>
-              <w:t>0.0375</w:t>
+              <w:t>0.1000</w:t>
             </w:r>
           </w:p>
         </w:tc>
@@ -1434,7 +1434,7 @@
                 <w:color w:val="000000"/>
                 <w:sz w:val="17"/>
               </w:rPr>
-              <w:t>unseen=1/829, %0.12</w:t>
+              <w:t>unseen=1/829, %0.1 (deterministik)</w:t>
             </w:r>
           </w:p>
         </w:tc>
@@ -1458,7 +1458,7 @@
           <w:color w:val="000000"/>
           <w:sz w:val="22"/>
         </w:rPr>
-        <w:t>Unseen senaryosunda 829 pattern içinden 1 unseen pattern görülmüştür. Bu pattern Levenshtein/Edit Distance ile en yakın train pattern'ına map edilmiştir. Noise/unseen deneyleri tek seed ile raporlandığı için bu durum sınırlılıklarda belirtilmiştir.</w:t>
+        <w:t>Unseen senaryosunda 829 pattern içinden 1 unseen pattern görülmüştür. Bu pattern Levenshtein/Edit Distance ile en yakın train pattern'ına map edilmiştir. Gürültü deneyi 5 random seed ile çalıştırılmıştır; unseen senaryosu deterministik otomata üzerinde çalıştığından seed etkisi yoktur.</w:t>
       </w:r>
     </w:p>
     <w:p>
@@ -2130,7 +2130,7 @@
                 <w:color w:val="000000"/>
                 <w:sz w:val="20"/>
               </w:rPr>
-              <w:t>0.4389</w:t>
+              <w:t>0.4383</w:t>
             </w:r>
           </w:p>
         </w:tc>
@@ -2301,7 +2301,7 @@
                 <w:color w:val="000000"/>
                 <w:sz w:val="20"/>
               </w:rPr>
-              <w:t>6.530 sn</w:t>
+              <w:t>6.195 sn</w:t>
             </w:r>
           </w:p>
         </w:tc>
@@ -2321,7 +2321,7 @@
                 <w:color w:val="000000"/>
                 <w:sz w:val="20"/>
               </w:rPr>
-              <w:t>0.2369 sn</w:t>
+              <w:t>0.2161 sn</w:t>
             </w:r>
           </w:p>
         </w:tc>
@@ -2363,7 +2363,7 @@
                 <w:color w:val="000000"/>
                 <w:sz w:val="20"/>
               </w:rPr>
-              <w:t>6.997 sn</w:t>
+              <w:t>7.243 sn</w:t>
             </w:r>
           </w:p>
         </w:tc>
@@ -2383,7 +2383,7 @@
                 <w:color w:val="000000"/>
                 <w:sz w:val="20"/>
               </w:rPr>
-              <w:t>0.2406 sn</w:t>
+              <w:t>0.2334 sn</w:t>
             </w:r>
           </w:p>
         </w:tc>
@@ -2562,7 +2562,7 @@
           <w:color w:val="000000"/>
           <w:sz w:val="22"/>
         </w:rPr>
-        <w:t>outputs/explainability_sample.json her karar için şu alanları üretir: state, pattern, status (seen/unseen), mapped_to, transition_prob, anomaly_score, path_probability, confidence ve decision. Örnek: normal bir adımda (time_step=8) state ccba → pattern ccaa, transition_prob=0.5327, karar=normal. Unseen örneği (outputs/unseen_sample_log.json, time_step=750): state acca, gelen pattern acaa (unseen) Levenshtein ile en yakın train pattern acca'ya map edildi; transition_prob=0.005848, anomaly_score=5.1417 → karar=anomaly.</w:t>
+        <w:t>outputs/explainability_sample.json her karar için şu alanları üretir: state, pattern, status (seen/unseen), mapped_to, transition_prob, anomaly_score, path_probability, confidence ve decision. Örnek: normal bir adımda (time_step=8) state ccba → pattern ccaa, transition_prob=0.5327, karar=normal. Unseen örneği (outputs/unseen_sample_log.json, time_step=750): state acca, gelen pattern acaa (unseen) Levenshtein ile en yakın train pattern acac'a map edildi; transition_prob=0.005848, anomaly_score=5.1417 → karar=anomaly.</w:t>
       </w:r>
     </w:p>
     <w:p>
@@ -2704,7 +2704,7 @@
           <w:color w:val="000000"/>
           <w:sz w:val="21"/>
         </w:rPr>
-        <w:t>SKAB DL early stopping ayrı validation fold kullanmadığı için test fold'unu izlemektedir (soft leakage).</w:t>
+        <w:t>SKAB DL early stopping için validation, train fold içindeki source_file gruplarından (~%20) ayrılır; early stopping bu validation'ın val_loss değerini izler. Test fold'u early stopping'de kullanılmaz; aynı CSV inner-train / validation / test arasında karışmaz.</w:t>
       </w:r>
     </w:p>
     <w:p>
@@ -2720,7 +2720,7 @@
           <w:color w:val="000000"/>
           <w:sz w:val="21"/>
         </w:rPr>
-        <w:t>Noise/unseen deneyleri tek seed (42) ile çalıştırılmıştır.</w:t>
+        <w:t>Gürültü deneyi 5 random seed [42, 123, 2026, 7, 999] ile çalıştırılmıştır; unseen senaryosu deterministik otomata üzerinde çalıştığından tek koşu yeterlidir (seed etkisi yok).</w:t>
       </w:r>
     </w:p>
     <w:p>
@@ -2768,7 +2768,7 @@
           <w:color w:val="000000"/>
           <w:sz w:val="21"/>
         </w:rPr>
-        <w:t>SKAB tarafında ayrıntılı Accuracy/Precision/Recall loglanmadığından F1 üzerinden karşılaştırma yapılmıştır.</w:t>
+        <w:t>SKAB için Accuracy, Precision, Recall ve F1 metriklerinin tümü fold/seed bazında loglanır ve mean ± std olarak raporlanır.</w:t>
       </w:r>
     </w:p>
     <w:p>

</xml_diff>